<commit_message>
feat(docs): agregar suite de 8 videotutoriales del portal y actualizar manuales
</commit_message>
<xml_diff>
--- a/docs/MANUAL_PORTAL_MYPLAYAD.docx
+++ b/docs/MANUAL_PORTAL_MYPLAYAD.docx
@@ -3778,6 +3778,1722 @@
           <w:sz w:val="20"/>
         </w:rPr>
         <w:t xml:space="preserve"> Cada juego cuenta con sus controladores web optimizados (joystick analógico, pad direccional de 4 vías o botones de acción hápticos) y su respectiva integración WebRTC de latencia cero.</w:t>
+      </w:r>
+    </w:p>
+    <w:p>
+      <w:pPr>
+        <w:spacing w:before="320" w:after="80"/>
+      </w:pPr>
+      <w:r>
+        <w:rPr>
+          <w:rFonts w:ascii="Calibri" w:hAnsi="Calibri"/>
+          <w:b/>
+          <w:color w:val="0E7490"/>
+          <w:sz w:val="30"/>
+        </w:rPr>
+        <w:t>12. Videotutoriales Interactivos y Flujos de Negocio Paso a Paso</w:t>
+      </w:r>
+    </w:p>
+    <w:p>
+      <w:pPr>
+        <w:spacing w:before="40" w:after="100" w:line="276" w:lineRule="auto"/>
+      </w:pPr>
+      <w:r>
+        <w:rPr>
+          <w:rFonts w:ascii="Calibri" w:hAnsi="Calibri"/>
+          <w:color w:val="1E293B"/>
+          <w:sz w:val="21"/>
+        </w:rPr>
+        <w:t xml:space="preserve">Para facilitar la capacitación de nuevos administradores y la inducción de clientes comerciales, el portal cuenta con una </w:t>
+      </w:r>
+      <w:r>
+        <w:rPr>
+          <w:rFonts w:ascii="Calibri" w:hAnsi="Calibri"/>
+          <w:b/>
+          <w:color w:val="1E293B"/>
+          <w:sz w:val="21"/>
+        </w:rPr>
+        <w:t>suite completa de 8 cápsulas de video tutorial</w:t>
+      </w:r>
+      <w:r>
+        <w:rPr>
+          <w:rFonts w:ascii="Calibri" w:hAnsi="Calibri"/>
+          <w:color w:val="1E293B"/>
+          <w:sz w:val="21"/>
+        </w:rPr>
+        <w:t xml:space="preserve"> grabadas en alta resolución (1440x900).</w:t>
+      </w:r>
+    </w:p>
+    <w:p>
+      <w:pPr>
+        <w:spacing w:before="40" w:after="100" w:line="276" w:lineRule="auto"/>
+      </w:pPr>
+      <w:r>
+        <w:rPr>
+          <w:rFonts w:ascii="Calibri" w:hAnsi="Calibri"/>
+          <w:color w:val="1E293B"/>
+          <w:sz w:val="21"/>
+        </w:rPr>
+        <w:t>Cada video incluye:</w:t>
+      </w:r>
+    </w:p>
+    <w:p>
+      <w:pPr>
+        <w:pStyle w:val="ListBullet"/>
+        <w:spacing w:before="20" w:after="40"/>
+        <w:ind w:left="360"/>
+      </w:pPr>
+      <w:r>
+        <w:rPr>
+          <w:rFonts w:ascii="Calibri" w:hAnsi="Calibri"/>
+          <w:b/>
+          <w:color w:val="1E293B"/>
+          <w:sz w:val="20"/>
+        </w:rPr>
+        <w:t>Cursor interactivo animado:</w:t>
+      </w:r>
+      <w:r>
+        <w:rPr>
+          <w:rFonts w:ascii="Calibri" w:hAnsi="Calibri"/>
+          <w:color w:val="1E293B"/>
+          <w:sz w:val="20"/>
+        </w:rPr>
+        <w:t xml:space="preserve"> Muestra desplazamientos fluidos y ondas de clic (</w:t>
+      </w:r>
+      <w:r>
+        <w:rPr>
+          <w:rFonts w:ascii="Calibri" w:hAnsi="Calibri"/>
+          <w:i/>
+          <w:color w:val="1E293B"/>
+          <w:sz w:val="20"/>
+        </w:rPr>
+        <w:t>ripple</w:t>
+      </w:r>
+      <w:r>
+        <w:rPr>
+          <w:rFonts w:ascii="Calibri" w:hAnsi="Calibri"/>
+          <w:color w:val="1E293B"/>
+          <w:sz w:val="20"/>
+        </w:rPr>
+        <w:t>) sobre los controles clave.</w:t>
+      </w:r>
+    </w:p>
+    <w:p>
+      <w:pPr>
+        <w:pStyle w:val="ListBullet"/>
+        <w:spacing w:before="20" w:after="40"/>
+        <w:ind w:left="360"/>
+      </w:pPr>
+      <w:r>
+        <w:rPr>
+          <w:rFonts w:ascii="Calibri" w:hAnsi="Calibri"/>
+          <w:b/>
+          <w:color w:val="1E293B"/>
+          <w:sz w:val="20"/>
+        </w:rPr>
+        <w:t>Banners informativos en tiempo real:</w:t>
+      </w:r>
+      <w:r>
+        <w:rPr>
+          <w:rFonts w:ascii="Calibri" w:hAnsi="Calibri"/>
+          <w:color w:val="1E293B"/>
+          <w:sz w:val="20"/>
+        </w:rPr>
+        <w:t xml:space="preserve"> Subtítulos al pie de la pantalla que explican la lógica de negocio y las validaciones de cada paso.</w:t>
+      </w:r>
+    </w:p>
+    <w:p>
+      <w:pPr>
+        <w:pStyle w:val="ListBullet"/>
+        <w:spacing w:before="20" w:after="40"/>
+        <w:ind w:left="360"/>
+      </w:pPr>
+      <w:r>
+        <w:rPr>
+          <w:rFonts w:ascii="Calibri" w:hAnsi="Calibri"/>
+          <w:b/>
+          <w:color w:val="1E293B"/>
+          <w:sz w:val="20"/>
+        </w:rPr>
+        <w:t>Pausas pedagógicas:</w:t>
+      </w:r>
+      <w:r>
+        <w:rPr>
+          <w:rFonts w:ascii="Calibri" w:hAnsi="Calibri"/>
+          <w:color w:val="1E293B"/>
+          <w:sz w:val="20"/>
+        </w:rPr>
+        <w:t xml:space="preserve"> Tiempos de lectura calibrados para asimilar las respuestas del sistema.</w:t>
+      </w:r>
+    </w:p>
+    <w:p>
+      <w:pPr>
+        <w:spacing w:before="240" w:after="60"/>
+      </w:pPr>
+      <w:r>
+        <w:rPr>
+          <w:rFonts w:ascii="Calibri" w:hAnsi="Calibri"/>
+          <w:b/>
+          <w:color w:val="0369A1"/>
+          <w:sz w:val="24"/>
+        </w:rPr>
+        <w:t>12.1. Catálogo de Videotutoriales</w:t>
+      </w:r>
+    </w:p>
+    <w:tbl>
+      <w:tblPr>
+        <w:tblW w:type="auto" w:w="0"/>
+        <w:jc w:val="center"/>
+        <w:tblLook w:firstColumn="1" w:firstRow="1" w:lastColumn="0" w:lastRow="0" w:noHBand="0" w:noVBand="1" w:val="04A0"/>
+      </w:tblPr>
+      <w:tblGrid>
+        <w:gridCol w:w="1872"/>
+        <w:gridCol w:w="1872"/>
+        <w:gridCol w:w="1872"/>
+        <w:gridCol w:w="1872"/>
+        <w:gridCol w:w="1872"/>
+      </w:tblGrid>
+      <w:tr>
+        <w:tc>
+          <w:tcPr>
+            <w:tcW w:type="dxa" w:w="1872"/>
+            <w:shd w:fill="0E7490"/>
+            <w:tcMar>
+              <w:top w:w="140" w:type="dxa"/>
+              <w:bottom w:w="140" w:type="dxa"/>
+              <w:left w:w="140" w:type="dxa"/>
+              <w:right w:w="140" w:type="dxa"/>
+            </w:tcMar>
+          </w:tcPr>
+          <w:p>
+            <w:pPr>
+              <w:spacing w:before="60" w:after="60"/>
+              <w:jc w:val="center"/>
+            </w:pPr>
+            <w:r>
+              <w:rPr>
+                <w:rFonts w:ascii="Calibri" w:hAnsi="Calibri"/>
+                <w:b/>
+                <w:color w:val="FFFFFF"/>
+                <w:sz w:val="19"/>
+              </w:rPr>
+              <w:t>#</w:t>
+            </w:r>
+          </w:p>
+        </w:tc>
+        <w:tc>
+          <w:tcPr>
+            <w:tcW w:type="dxa" w:w="1872"/>
+            <w:shd w:fill="0E7490"/>
+            <w:tcMar>
+              <w:top w:w="140" w:type="dxa"/>
+              <w:bottom w:w="140" w:type="dxa"/>
+              <w:left w:w="140" w:type="dxa"/>
+              <w:right w:w="140" w:type="dxa"/>
+            </w:tcMar>
+          </w:tcPr>
+          <w:p>
+            <w:pPr>
+              <w:spacing w:before="60" w:after="60"/>
+              <w:jc w:val="center"/>
+            </w:pPr>
+            <w:r>
+              <w:rPr>
+                <w:rFonts w:ascii="Calibri" w:hAnsi="Calibri"/>
+                <w:b/>
+                <w:color w:val="FFFFFF"/>
+                <w:sz w:val="19"/>
+              </w:rPr>
+              <w:t>Cápsula / Archivo</w:t>
+            </w:r>
+          </w:p>
+        </w:tc>
+        <w:tc>
+          <w:tcPr>
+            <w:tcW w:type="dxa" w:w="1872"/>
+            <w:shd w:fill="0E7490"/>
+            <w:tcMar>
+              <w:top w:w="140" w:type="dxa"/>
+              <w:bottom w:w="140" w:type="dxa"/>
+              <w:left w:w="140" w:type="dxa"/>
+              <w:right w:w="140" w:type="dxa"/>
+            </w:tcMar>
+          </w:tcPr>
+          <w:p>
+            <w:pPr>
+              <w:spacing w:before="60" w:after="60"/>
+              <w:jc w:val="center"/>
+            </w:pPr>
+            <w:r>
+              <w:rPr>
+                <w:rFonts w:ascii="Calibri" w:hAnsi="Calibri"/>
+                <w:b/>
+                <w:color w:val="FFFFFF"/>
+                <w:sz w:val="19"/>
+              </w:rPr>
+              <w:t>Tamaño</w:t>
+            </w:r>
+          </w:p>
+        </w:tc>
+        <w:tc>
+          <w:tcPr>
+            <w:tcW w:type="dxa" w:w="1872"/>
+            <w:shd w:fill="0E7490"/>
+            <w:tcMar>
+              <w:top w:w="140" w:type="dxa"/>
+              <w:bottom w:w="140" w:type="dxa"/>
+              <w:left w:w="140" w:type="dxa"/>
+              <w:right w:w="140" w:type="dxa"/>
+            </w:tcMar>
+          </w:tcPr>
+          <w:p>
+            <w:pPr>
+              <w:spacing w:before="60" w:after="60"/>
+              <w:jc w:val="center"/>
+            </w:pPr>
+            <w:r>
+              <w:rPr>
+                <w:rFonts w:ascii="Calibri" w:hAnsi="Calibri"/>
+                <w:b/>
+                <w:color w:val="FFFFFF"/>
+                <w:sz w:val="19"/>
+              </w:rPr>
+              <w:t>Duración</w:t>
+            </w:r>
+          </w:p>
+        </w:tc>
+        <w:tc>
+          <w:tcPr>
+            <w:tcW w:type="dxa" w:w="1872"/>
+            <w:shd w:fill="0E7490"/>
+            <w:tcMar>
+              <w:top w:w="140" w:type="dxa"/>
+              <w:bottom w:w="140" w:type="dxa"/>
+              <w:left w:w="140" w:type="dxa"/>
+              <w:right w:w="140" w:type="dxa"/>
+            </w:tcMar>
+          </w:tcPr>
+          <w:p>
+            <w:pPr>
+              <w:spacing w:before="60" w:after="60"/>
+              <w:jc w:val="center"/>
+            </w:pPr>
+            <w:r>
+              <w:rPr>
+                <w:rFonts w:ascii="Calibri" w:hAnsi="Calibri"/>
+                <w:b/>
+                <w:color w:val="FFFFFF"/>
+                <w:sz w:val="19"/>
+              </w:rPr>
+              <w:t>Descripción y Flujo Cubierto</w:t>
+            </w:r>
+          </w:p>
+        </w:tc>
+      </w:tr>
+      <w:tr>
+        <w:tc>
+          <w:tcPr>
+            <w:tcW w:type="dxa" w:w="1872"/>
+            <w:shd w:fill="F8FAFC"/>
+            <w:tcMar>
+              <w:top w:w="100" w:type="dxa"/>
+              <w:bottom w:w="100" w:type="dxa"/>
+              <w:left w:w="120" w:type="dxa"/>
+              <w:right w:w="120" w:type="dxa"/>
+            </w:tcMar>
+          </w:tcPr>
+          <w:p>
+            <w:pPr>
+              <w:spacing w:before="40" w:after="40"/>
+            </w:pPr>
+            <w:r>
+              <w:rPr>
+                <w:rFonts w:ascii="Calibri" w:hAnsi="Calibri"/>
+                <w:b/>
+                <w:color w:val="1E293B"/>
+                <w:sz w:val="18"/>
+              </w:rPr>
+              <w:t>01</w:t>
+            </w:r>
+          </w:p>
+        </w:tc>
+        <w:tc>
+          <w:tcPr>
+            <w:tcW w:type="dxa" w:w="1872"/>
+            <w:shd w:fill="F8FAFC"/>
+            <w:tcMar>
+              <w:top w:w="100" w:type="dxa"/>
+              <w:bottom w:w="100" w:type="dxa"/>
+              <w:left w:w="120" w:type="dxa"/>
+              <w:right w:w="120" w:type="dxa"/>
+            </w:tcMar>
+          </w:tcPr>
+          <w:p>
+            <w:pPr>
+              <w:spacing w:before="40" w:after="40"/>
+            </w:pPr>
+            <w:r>
+              <w:rPr>
+                <w:rFonts w:ascii="Consolas" w:hAnsi="Consolas"/>
+                <w:color w:val="0284C7"/>
+                <w:sz w:val="16"/>
+              </w:rPr>
+              <w:t>videos/01-creacion-planes-comerciales.webm</w:t>
+            </w:r>
+          </w:p>
+        </w:tc>
+        <w:tc>
+          <w:tcPr>
+            <w:tcW w:type="dxa" w:w="1872"/>
+            <w:shd w:fill="F8FAFC"/>
+            <w:tcMar>
+              <w:top w:w="100" w:type="dxa"/>
+              <w:bottom w:w="100" w:type="dxa"/>
+              <w:left w:w="120" w:type="dxa"/>
+              <w:right w:w="120" w:type="dxa"/>
+            </w:tcMar>
+          </w:tcPr>
+          <w:p>
+            <w:pPr>
+              <w:spacing w:before="40" w:after="40"/>
+            </w:pPr>
+            <w:r>
+              <w:rPr>
+                <w:rFonts w:ascii="Calibri" w:hAnsi="Calibri"/>
+                <w:color w:val="1E293B"/>
+                <w:sz w:val="18"/>
+              </w:rPr>
+              <w:t>2.10 MB</w:t>
+            </w:r>
+          </w:p>
+        </w:tc>
+        <w:tc>
+          <w:tcPr>
+            <w:tcW w:type="dxa" w:w="1872"/>
+            <w:shd w:fill="F8FAFC"/>
+            <w:tcMar>
+              <w:top w:w="100" w:type="dxa"/>
+              <w:bottom w:w="100" w:type="dxa"/>
+              <w:left w:w="120" w:type="dxa"/>
+              <w:right w:w="120" w:type="dxa"/>
+            </w:tcMar>
+          </w:tcPr>
+          <w:p>
+            <w:pPr>
+              <w:spacing w:before="40" w:after="40"/>
+            </w:pPr>
+            <w:r>
+              <w:rPr>
+                <w:rFonts w:ascii="Calibri" w:hAnsi="Calibri"/>
+                <w:color w:val="1E293B"/>
+                <w:sz w:val="18"/>
+              </w:rPr>
+              <w:t>~33s</w:t>
+            </w:r>
+          </w:p>
+        </w:tc>
+        <w:tc>
+          <w:tcPr>
+            <w:tcW w:type="dxa" w:w="1872"/>
+            <w:shd w:fill="F8FAFC"/>
+            <w:tcMar>
+              <w:top w:w="100" w:type="dxa"/>
+              <w:bottom w:w="100" w:type="dxa"/>
+              <w:left w:w="120" w:type="dxa"/>
+              <w:right w:w="120" w:type="dxa"/>
+            </w:tcMar>
+          </w:tcPr>
+          <w:p>
+            <w:pPr>
+              <w:spacing w:before="40" w:after="40"/>
+            </w:pPr>
+            <w:r>
+              <w:rPr>
+                <w:rFonts w:ascii="Calibri" w:hAnsi="Calibri"/>
+                <w:b/>
+                <w:color w:val="1E293B"/>
+                <w:sz w:val="18"/>
+              </w:rPr>
+              <w:t>Creación y Configuración de Planes Comerciales:</w:t>
+            </w:r>
+            <w:r>
+              <w:rPr>
+                <w:rFonts w:ascii="Calibri" w:hAnsi="Calibri"/>
+                <w:color w:val="1E293B"/>
+                <w:sz w:val="18"/>
+              </w:rPr>
+              <w:t xml:space="preserve"> Cimiento del negocio. Muestra cómo crear un paquete comercial, fijar la cuota estricta </w:t>
+            </w:r>
+            <w:r>
+              <w:rPr>
+                <w:rFonts w:ascii="Consolas" w:hAnsi="Consolas"/>
+                <w:color w:val="0284C7"/>
+                <w:sz w:val="16"/>
+              </w:rPr>
+              <w:t>maxVideosPerScreen</w:t>
+            </w:r>
+            <w:r>
+              <w:rPr>
+                <w:rFonts w:ascii="Calibri" w:hAnsi="Calibri"/>
+                <w:color w:val="1E293B"/>
+                <w:sz w:val="18"/>
+              </w:rPr>
+              <w:t xml:space="preserve"> (5 videos) y seleccionar los juegos arcade autorizados.</w:t>
+            </w:r>
+          </w:p>
+        </w:tc>
+      </w:tr>
+      <w:tr>
+        <w:tc>
+          <w:tcPr>
+            <w:tcW w:type="dxa" w:w="1872"/>
+            <w:shd w:fill="FFFFFF"/>
+            <w:tcMar>
+              <w:top w:w="100" w:type="dxa"/>
+              <w:bottom w:w="100" w:type="dxa"/>
+              <w:left w:w="120" w:type="dxa"/>
+              <w:right w:w="120" w:type="dxa"/>
+            </w:tcMar>
+          </w:tcPr>
+          <w:p>
+            <w:pPr>
+              <w:spacing w:before="40" w:after="40"/>
+            </w:pPr>
+            <w:r>
+              <w:rPr>
+                <w:rFonts w:ascii="Calibri" w:hAnsi="Calibri"/>
+                <w:b/>
+                <w:color w:val="1E293B"/>
+                <w:sz w:val="18"/>
+              </w:rPr>
+              <w:t>02</w:t>
+            </w:r>
+          </w:p>
+        </w:tc>
+        <w:tc>
+          <w:tcPr>
+            <w:tcW w:type="dxa" w:w="1872"/>
+            <w:shd w:fill="FFFFFF"/>
+            <w:tcMar>
+              <w:top w:w="100" w:type="dxa"/>
+              <w:bottom w:w="100" w:type="dxa"/>
+              <w:left w:w="120" w:type="dxa"/>
+              <w:right w:w="120" w:type="dxa"/>
+            </w:tcMar>
+          </w:tcPr>
+          <w:p>
+            <w:pPr>
+              <w:spacing w:before="40" w:after="40"/>
+            </w:pPr>
+            <w:r>
+              <w:rPr>
+                <w:rFonts w:ascii="Consolas" w:hAnsi="Consolas"/>
+                <w:color w:val="0284C7"/>
+                <w:sz w:val="16"/>
+              </w:rPr>
+              <w:t>videos/02-alta-pantalla-kiosco.webm</w:t>
+            </w:r>
+          </w:p>
+        </w:tc>
+        <w:tc>
+          <w:tcPr>
+            <w:tcW w:type="dxa" w:w="1872"/>
+            <w:shd w:fill="FFFFFF"/>
+            <w:tcMar>
+              <w:top w:w="100" w:type="dxa"/>
+              <w:bottom w:w="100" w:type="dxa"/>
+              <w:left w:w="120" w:type="dxa"/>
+              <w:right w:w="120" w:type="dxa"/>
+            </w:tcMar>
+          </w:tcPr>
+          <w:p>
+            <w:pPr>
+              <w:spacing w:before="40" w:after="40"/>
+            </w:pPr>
+            <w:r>
+              <w:rPr>
+                <w:rFonts w:ascii="Calibri" w:hAnsi="Calibri"/>
+                <w:color w:val="1E293B"/>
+                <w:sz w:val="18"/>
+              </w:rPr>
+              <w:t>2.76 MB</w:t>
+            </w:r>
+          </w:p>
+        </w:tc>
+        <w:tc>
+          <w:tcPr>
+            <w:tcW w:type="dxa" w:w="1872"/>
+            <w:shd w:fill="FFFFFF"/>
+            <w:tcMar>
+              <w:top w:w="100" w:type="dxa"/>
+              <w:bottom w:w="100" w:type="dxa"/>
+              <w:left w:w="120" w:type="dxa"/>
+              <w:right w:w="120" w:type="dxa"/>
+            </w:tcMar>
+          </w:tcPr>
+          <w:p>
+            <w:pPr>
+              <w:spacing w:before="40" w:after="40"/>
+            </w:pPr>
+            <w:r>
+              <w:rPr>
+                <w:rFonts w:ascii="Calibri" w:hAnsi="Calibri"/>
+                <w:color w:val="1E293B"/>
+                <w:sz w:val="18"/>
+              </w:rPr>
+              <w:t>~40s</w:t>
+            </w:r>
+          </w:p>
+        </w:tc>
+        <w:tc>
+          <w:tcPr>
+            <w:tcW w:type="dxa" w:w="1872"/>
+            <w:shd w:fill="FFFFFF"/>
+            <w:tcMar>
+              <w:top w:w="100" w:type="dxa"/>
+              <w:bottom w:w="100" w:type="dxa"/>
+              <w:left w:w="120" w:type="dxa"/>
+              <w:right w:w="120" w:type="dxa"/>
+            </w:tcMar>
+          </w:tcPr>
+          <w:p>
+            <w:pPr>
+              <w:spacing w:before="40" w:after="40"/>
+            </w:pPr>
+            <w:r>
+              <w:rPr>
+                <w:rFonts w:ascii="Calibri" w:hAnsi="Calibri"/>
+                <w:b/>
+                <w:color w:val="1E293B"/>
+                <w:sz w:val="18"/>
+              </w:rPr>
+              <w:t>Alta y Configuración de Pantalla (Kiosco Físico):</w:t>
+            </w:r>
+            <w:r>
+              <w:rPr>
+                <w:rFonts w:ascii="Calibri" w:hAnsi="Calibri"/>
+                <w:color w:val="1E293B"/>
+                <w:sz w:val="18"/>
+              </w:rPr>
+              <w:t xml:space="preserve"> Registro del tótem comercial, vinculación de la consola Raspberry Pi 5 (</w:t>
+            </w:r>
+            <w:r>
+              <w:rPr>
+                <w:rFonts w:ascii="Consolas" w:hAnsi="Consolas"/>
+                <w:color w:val="0284C7"/>
+                <w:sz w:val="16"/>
+              </w:rPr>
+              <w:t>consoleId</w:t>
+            </w:r>
+            <w:r>
+              <w:rPr>
+                <w:rFonts w:ascii="Calibri" w:hAnsi="Calibri"/>
+                <w:color w:val="1E293B"/>
+                <w:sz w:val="18"/>
+              </w:rPr>
+              <w:t xml:space="preserve">), horarios diarios HDMI-CEC (08:00 a 22:00) y copia de </w:t>
+            </w:r>
+            <w:r>
+              <w:rPr>
+                <w:rFonts w:ascii="Consolas" w:hAnsi="Consolas"/>
+                <w:color w:val="0284C7"/>
+                <w:sz w:val="16"/>
+              </w:rPr>
+              <w:t>SCREEN_ID</w:t>
+            </w:r>
+            <w:r>
+              <w:rPr>
+                <w:rFonts w:ascii="Calibri" w:hAnsi="Calibri"/>
+                <w:color w:val="1E293B"/>
+                <w:sz w:val="18"/>
+              </w:rPr>
+              <w:t>.</w:t>
+            </w:r>
+          </w:p>
+        </w:tc>
+      </w:tr>
+      <w:tr>
+        <w:tc>
+          <w:tcPr>
+            <w:tcW w:type="dxa" w:w="1872"/>
+            <w:shd w:fill="F8FAFC"/>
+            <w:tcMar>
+              <w:top w:w="100" w:type="dxa"/>
+              <w:bottom w:w="100" w:type="dxa"/>
+              <w:left w:w="120" w:type="dxa"/>
+              <w:right w:w="120" w:type="dxa"/>
+            </w:tcMar>
+          </w:tcPr>
+          <w:p>
+            <w:pPr>
+              <w:spacing w:before="40" w:after="40"/>
+            </w:pPr>
+            <w:r>
+              <w:rPr>
+                <w:rFonts w:ascii="Calibri" w:hAnsi="Calibri"/>
+                <w:b/>
+                <w:color w:val="1E293B"/>
+                <w:sz w:val="18"/>
+              </w:rPr>
+              <w:t>03</w:t>
+            </w:r>
+          </w:p>
+        </w:tc>
+        <w:tc>
+          <w:tcPr>
+            <w:tcW w:type="dxa" w:w="1872"/>
+            <w:shd w:fill="F8FAFC"/>
+            <w:tcMar>
+              <w:top w:w="100" w:type="dxa"/>
+              <w:bottom w:w="100" w:type="dxa"/>
+              <w:left w:w="120" w:type="dxa"/>
+              <w:right w:w="120" w:type="dxa"/>
+            </w:tcMar>
+          </w:tcPr>
+          <w:p>
+            <w:pPr>
+              <w:spacing w:before="40" w:after="40"/>
+            </w:pPr>
+            <w:r>
+              <w:rPr>
+                <w:rFonts w:ascii="Consolas" w:hAnsi="Consolas"/>
+                <w:color w:val="0284C7"/>
+                <w:sz w:val="16"/>
+              </w:rPr>
+              <w:t>videos/03-alta-cliente-y-asignacion.webm</w:t>
+            </w:r>
+          </w:p>
+        </w:tc>
+        <w:tc>
+          <w:tcPr>
+            <w:tcW w:type="dxa" w:w="1872"/>
+            <w:shd w:fill="F8FAFC"/>
+            <w:tcMar>
+              <w:top w:w="100" w:type="dxa"/>
+              <w:bottom w:w="100" w:type="dxa"/>
+              <w:left w:w="120" w:type="dxa"/>
+              <w:right w:w="120" w:type="dxa"/>
+            </w:tcMar>
+          </w:tcPr>
+          <w:p>
+            <w:pPr>
+              <w:spacing w:before="40" w:after="40"/>
+            </w:pPr>
+            <w:r>
+              <w:rPr>
+                <w:rFonts w:ascii="Calibri" w:hAnsi="Calibri"/>
+                <w:color w:val="1E293B"/>
+                <w:sz w:val="18"/>
+              </w:rPr>
+              <w:t>2.12 MB</w:t>
+            </w:r>
+          </w:p>
+        </w:tc>
+        <w:tc>
+          <w:tcPr>
+            <w:tcW w:type="dxa" w:w="1872"/>
+            <w:shd w:fill="F8FAFC"/>
+            <w:tcMar>
+              <w:top w:w="100" w:type="dxa"/>
+              <w:bottom w:w="100" w:type="dxa"/>
+              <w:left w:w="120" w:type="dxa"/>
+              <w:right w:w="120" w:type="dxa"/>
+            </w:tcMar>
+          </w:tcPr>
+          <w:p>
+            <w:pPr>
+              <w:spacing w:before="40" w:after="40"/>
+            </w:pPr>
+            <w:r>
+              <w:rPr>
+                <w:rFonts w:ascii="Calibri" w:hAnsi="Calibri"/>
+                <w:color w:val="1E293B"/>
+                <w:sz w:val="18"/>
+              </w:rPr>
+              <w:t>~30s</w:t>
+            </w:r>
+          </w:p>
+        </w:tc>
+        <w:tc>
+          <w:tcPr>
+            <w:tcW w:type="dxa" w:w="1872"/>
+            <w:shd w:fill="F8FAFC"/>
+            <w:tcMar>
+              <w:top w:w="100" w:type="dxa"/>
+              <w:bottom w:w="100" w:type="dxa"/>
+              <w:left w:w="120" w:type="dxa"/>
+              <w:right w:w="120" w:type="dxa"/>
+            </w:tcMar>
+          </w:tcPr>
+          <w:p>
+            <w:pPr>
+              <w:spacing w:before="40" w:after="40"/>
+            </w:pPr>
+            <w:r>
+              <w:rPr>
+                <w:rFonts w:ascii="Calibri" w:hAnsi="Calibri"/>
+                <w:b/>
+                <w:color w:val="1E293B"/>
+                <w:sz w:val="18"/>
+              </w:rPr>
+              <w:t>Alta de Cliente Comercial y Asignación de Recursos:</w:t>
+            </w:r>
+            <w:r>
+              <w:rPr>
+                <w:rFonts w:ascii="Calibri" w:hAnsi="Calibri"/>
+                <w:color w:val="1E293B"/>
+                <w:sz w:val="18"/>
+              </w:rPr>
+              <w:t xml:space="preserve"> Creación de cuenta de anunciante (</w:t>
+            </w:r>
+            <w:r>
+              <w:rPr>
+                <w:rFonts w:ascii="Consolas" w:hAnsi="Consolas"/>
+                <w:color w:val="0284C7"/>
+                <w:sz w:val="16"/>
+              </w:rPr>
+              <w:t>cliente_titan</w:t>
+            </w:r>
+            <w:r>
+              <w:rPr>
+                <w:rFonts w:ascii="Calibri" w:hAnsi="Calibri"/>
+                <w:color w:val="1E293B"/>
+                <w:sz w:val="18"/>
+              </w:rPr>
+              <w:t xml:space="preserve">), vinculación de su plan comercial, vigencia del contrato mediante el atajo </w:t>
+            </w:r>
+            <w:r>
+              <w:rPr>
+                <w:rFonts w:ascii="Consolas" w:hAnsi="Consolas"/>
+                <w:color w:val="0284C7"/>
+                <w:sz w:val="16"/>
+              </w:rPr>
+              <w:t>+1 Año</w:t>
+            </w:r>
+            <w:r>
+              <w:rPr>
+                <w:rFonts w:ascii="Calibri" w:hAnsi="Calibri"/>
+                <w:color w:val="1E293B"/>
+                <w:sz w:val="18"/>
+              </w:rPr>
+              <w:t xml:space="preserve"> y asignación de la pantalla creada.</w:t>
+            </w:r>
+          </w:p>
+        </w:tc>
+      </w:tr>
+      <w:tr>
+        <w:tc>
+          <w:tcPr>
+            <w:tcW w:type="dxa" w:w="1872"/>
+            <w:shd w:fill="FFFFFF"/>
+            <w:tcMar>
+              <w:top w:w="100" w:type="dxa"/>
+              <w:bottom w:w="100" w:type="dxa"/>
+              <w:left w:w="120" w:type="dxa"/>
+              <w:right w:w="120" w:type="dxa"/>
+            </w:tcMar>
+          </w:tcPr>
+          <w:p>
+            <w:pPr>
+              <w:spacing w:before="40" w:after="40"/>
+            </w:pPr>
+            <w:r>
+              <w:rPr>
+                <w:rFonts w:ascii="Calibri" w:hAnsi="Calibri"/>
+                <w:b/>
+                <w:color w:val="1E293B"/>
+                <w:sz w:val="18"/>
+              </w:rPr>
+              <w:t>04</w:t>
+            </w:r>
+          </w:p>
+        </w:tc>
+        <w:tc>
+          <w:tcPr>
+            <w:tcW w:type="dxa" w:w="1872"/>
+            <w:shd w:fill="FFFFFF"/>
+            <w:tcMar>
+              <w:top w:w="100" w:type="dxa"/>
+              <w:bottom w:w="100" w:type="dxa"/>
+              <w:left w:w="120" w:type="dxa"/>
+              <w:right w:w="120" w:type="dxa"/>
+            </w:tcMar>
+          </w:tcPr>
+          <w:p>
+            <w:pPr>
+              <w:spacing w:before="40" w:after="40"/>
+            </w:pPr>
+            <w:r>
+              <w:rPr>
+                <w:rFonts w:ascii="Consolas" w:hAnsi="Consolas"/>
+                <w:color w:val="0284C7"/>
+                <w:sz w:val="16"/>
+              </w:rPr>
+              <w:t>videos/04-subida-videos-y-cuotas.webm</w:t>
+            </w:r>
+          </w:p>
+        </w:tc>
+        <w:tc>
+          <w:tcPr>
+            <w:tcW w:type="dxa" w:w="1872"/>
+            <w:shd w:fill="FFFFFF"/>
+            <w:tcMar>
+              <w:top w:w="100" w:type="dxa"/>
+              <w:bottom w:w="100" w:type="dxa"/>
+              <w:left w:w="120" w:type="dxa"/>
+              <w:right w:w="120" w:type="dxa"/>
+            </w:tcMar>
+          </w:tcPr>
+          <w:p>
+            <w:pPr>
+              <w:spacing w:before="40" w:after="40"/>
+            </w:pPr>
+            <w:r>
+              <w:rPr>
+                <w:rFonts w:ascii="Calibri" w:hAnsi="Calibri"/>
+                <w:color w:val="1E293B"/>
+                <w:sz w:val="18"/>
+              </w:rPr>
+              <w:t>1.64 MB</w:t>
+            </w:r>
+          </w:p>
+        </w:tc>
+        <w:tc>
+          <w:tcPr>
+            <w:tcW w:type="dxa" w:w="1872"/>
+            <w:shd w:fill="FFFFFF"/>
+            <w:tcMar>
+              <w:top w:w="100" w:type="dxa"/>
+              <w:bottom w:w="100" w:type="dxa"/>
+              <w:left w:w="120" w:type="dxa"/>
+              <w:right w:w="120" w:type="dxa"/>
+            </w:tcMar>
+          </w:tcPr>
+          <w:p>
+            <w:pPr>
+              <w:spacing w:before="40" w:after="40"/>
+            </w:pPr>
+            <w:r>
+              <w:rPr>
+                <w:rFonts w:ascii="Calibri" w:hAnsi="Calibri"/>
+                <w:color w:val="1E293B"/>
+                <w:sz w:val="18"/>
+              </w:rPr>
+              <w:t>~25s</w:t>
+            </w:r>
+          </w:p>
+        </w:tc>
+        <w:tc>
+          <w:tcPr>
+            <w:tcW w:type="dxa" w:w="1872"/>
+            <w:shd w:fill="FFFFFF"/>
+            <w:tcMar>
+              <w:top w:w="100" w:type="dxa"/>
+              <w:bottom w:w="100" w:type="dxa"/>
+              <w:left w:w="120" w:type="dxa"/>
+              <w:right w:w="120" w:type="dxa"/>
+            </w:tcMar>
+          </w:tcPr>
+          <w:p>
+            <w:pPr>
+              <w:spacing w:before="40" w:after="40"/>
+            </w:pPr>
+            <w:r>
+              <w:rPr>
+                <w:rFonts w:ascii="Calibri" w:hAnsi="Calibri"/>
+                <w:b/>
+                <w:color w:val="1E293B"/>
+                <w:sz w:val="18"/>
+              </w:rPr>
+              <w:t>Subida de Videos Publicitarios y Validación de Cuotas:</w:t>
+            </w:r>
+            <w:r>
+              <w:rPr>
+                <w:rFonts w:ascii="Calibri" w:hAnsi="Calibri"/>
+                <w:color w:val="1E293B"/>
+                <w:sz w:val="18"/>
+              </w:rPr>
+              <w:t xml:space="preserve"> Carga de spot en MP4, selección del cliente y pantalla propietaria, y demostración del indicador de cuota (</w:t>
+            </w:r>
+            <w:r>
+              <w:rPr>
+                <w:rFonts w:ascii="Consolas" w:hAnsi="Consolas"/>
+                <w:color w:val="0284C7"/>
+                <w:sz w:val="16"/>
+              </w:rPr>
+              <w:t>X / 5 videos usados</w:t>
+            </w:r>
+            <w:r>
+              <w:rPr>
+                <w:rFonts w:ascii="Calibri" w:hAnsi="Calibri"/>
+                <w:color w:val="1E293B"/>
+                <w:sz w:val="18"/>
+              </w:rPr>
+              <w:t>) para evitar sobrecupos.</w:t>
+            </w:r>
+          </w:p>
+        </w:tc>
+      </w:tr>
+      <w:tr>
+        <w:tc>
+          <w:tcPr>
+            <w:tcW w:type="dxa" w:w="1872"/>
+            <w:shd w:fill="F8FAFC"/>
+            <w:tcMar>
+              <w:top w:w="100" w:type="dxa"/>
+              <w:bottom w:w="100" w:type="dxa"/>
+              <w:left w:w="120" w:type="dxa"/>
+              <w:right w:w="120" w:type="dxa"/>
+            </w:tcMar>
+          </w:tcPr>
+          <w:p>
+            <w:pPr>
+              <w:spacing w:before="40" w:after="40"/>
+            </w:pPr>
+            <w:r>
+              <w:rPr>
+                <w:rFonts w:ascii="Calibri" w:hAnsi="Calibri"/>
+                <w:b/>
+                <w:color w:val="1E293B"/>
+                <w:sz w:val="18"/>
+              </w:rPr>
+              <w:t>05</w:t>
+            </w:r>
+          </w:p>
+        </w:tc>
+        <w:tc>
+          <w:tcPr>
+            <w:tcW w:type="dxa" w:w="1872"/>
+            <w:shd w:fill="F8FAFC"/>
+            <w:tcMar>
+              <w:top w:w="100" w:type="dxa"/>
+              <w:bottom w:w="100" w:type="dxa"/>
+              <w:left w:w="120" w:type="dxa"/>
+              <w:right w:w="120" w:type="dxa"/>
+            </w:tcMar>
+          </w:tcPr>
+          <w:p>
+            <w:pPr>
+              <w:spacing w:before="40" w:after="40"/>
+            </w:pPr>
+            <w:r>
+              <w:rPr>
+                <w:rFonts w:ascii="Consolas" w:hAnsi="Consolas"/>
+                <w:color w:val="0284C7"/>
+                <w:sz w:val="16"/>
+              </w:rPr>
+              <w:t>videos/05-programacion-juegos-arcade.webm</w:t>
+            </w:r>
+          </w:p>
+        </w:tc>
+        <w:tc>
+          <w:tcPr>
+            <w:tcW w:type="dxa" w:w="1872"/>
+            <w:shd w:fill="F8FAFC"/>
+            <w:tcMar>
+              <w:top w:w="100" w:type="dxa"/>
+              <w:bottom w:w="100" w:type="dxa"/>
+              <w:left w:w="120" w:type="dxa"/>
+              <w:right w:w="120" w:type="dxa"/>
+            </w:tcMar>
+          </w:tcPr>
+          <w:p>
+            <w:pPr>
+              <w:spacing w:before="40" w:after="40"/>
+            </w:pPr>
+            <w:r>
+              <w:rPr>
+                <w:rFonts w:ascii="Calibri" w:hAnsi="Calibri"/>
+                <w:color w:val="1E293B"/>
+                <w:sz w:val="18"/>
+              </w:rPr>
+              <w:t>2.30 MB</w:t>
+            </w:r>
+          </w:p>
+        </w:tc>
+        <w:tc>
+          <w:tcPr>
+            <w:tcW w:type="dxa" w:w="1872"/>
+            <w:shd w:fill="F8FAFC"/>
+            <w:tcMar>
+              <w:top w:w="100" w:type="dxa"/>
+              <w:bottom w:w="100" w:type="dxa"/>
+              <w:left w:w="120" w:type="dxa"/>
+              <w:right w:w="120" w:type="dxa"/>
+            </w:tcMar>
+          </w:tcPr>
+          <w:p>
+            <w:pPr>
+              <w:spacing w:before="40" w:after="40"/>
+            </w:pPr>
+            <w:r>
+              <w:rPr>
+                <w:rFonts w:ascii="Calibri" w:hAnsi="Calibri"/>
+                <w:color w:val="1E293B"/>
+                <w:sz w:val="18"/>
+              </w:rPr>
+              <w:t>~35s</w:t>
+            </w:r>
+          </w:p>
+        </w:tc>
+        <w:tc>
+          <w:tcPr>
+            <w:tcW w:type="dxa" w:w="1872"/>
+            <w:shd w:fill="F8FAFC"/>
+            <w:tcMar>
+              <w:top w:w="100" w:type="dxa"/>
+              <w:bottom w:w="100" w:type="dxa"/>
+              <w:left w:w="120" w:type="dxa"/>
+              <w:right w:w="120" w:type="dxa"/>
+            </w:tcMar>
+          </w:tcPr>
+          <w:p>
+            <w:pPr>
+              <w:spacing w:before="40" w:after="40"/>
+            </w:pPr>
+            <w:r>
+              <w:rPr>
+                <w:rFonts w:ascii="Calibri" w:hAnsi="Calibri"/>
+                <w:b/>
+                <w:color w:val="1E293B"/>
+                <w:sz w:val="18"/>
+              </w:rPr>
+              <w:t>Asignación y Calendario Arcade:</w:t>
+            </w:r>
+            <w:r>
+              <w:rPr>
+                <w:rFonts w:ascii="Calibri" w:hAnsi="Calibri"/>
+                <w:color w:val="1E293B"/>
+                <w:sz w:val="18"/>
+              </w:rPr>
+              <w:t xml:space="preserve"> Configuración del minijuego base por defecto (</w:t>
+            </w:r>
+            <w:r>
+              <w:rPr>
+                <w:rFonts w:ascii="Calibri" w:hAnsi="Calibri"/>
+                <w:i/>
+                <w:color w:val="1E293B"/>
+                <w:sz w:val="18"/>
+              </w:rPr>
+              <w:t>Arkanoid</w:t>
+            </w:r>
+            <w:r>
+              <w:rPr>
+                <w:rFonts w:ascii="Calibri" w:hAnsi="Calibri"/>
+                <w:color w:val="1E293B"/>
+                <w:sz w:val="18"/>
+              </w:rPr>
+              <w:t>) y creación de una programación en el calendario (</w:t>
+            </w:r>
+            <w:r>
+              <w:rPr>
+                <w:rFonts w:ascii="Consolas" w:hAnsi="Consolas"/>
+                <w:color w:val="0284C7"/>
+                <w:sz w:val="16"/>
+              </w:rPr>
+              <w:t>Schedule</w:t>
+            </w:r>
+            <w:r>
+              <w:rPr>
+                <w:rFonts w:ascii="Calibri" w:hAnsi="Calibri"/>
+                <w:color w:val="1E293B"/>
+                <w:sz w:val="18"/>
+              </w:rPr>
+              <w:t>) para un torneo o promoción especial con fechas de inicio y fin.</w:t>
+            </w:r>
+          </w:p>
+        </w:tc>
+      </w:tr>
+      <w:tr>
+        <w:tc>
+          <w:tcPr>
+            <w:tcW w:type="dxa" w:w="1872"/>
+            <w:shd w:fill="FFFFFF"/>
+            <w:tcMar>
+              <w:top w:w="100" w:type="dxa"/>
+              <w:bottom w:w="100" w:type="dxa"/>
+              <w:left w:w="120" w:type="dxa"/>
+              <w:right w:w="120" w:type="dxa"/>
+            </w:tcMar>
+          </w:tcPr>
+          <w:p>
+            <w:pPr>
+              <w:spacing w:before="40" w:after="40"/>
+            </w:pPr>
+            <w:r>
+              <w:rPr>
+                <w:rFonts w:ascii="Calibri" w:hAnsi="Calibri"/>
+                <w:b/>
+                <w:color w:val="1E293B"/>
+                <w:sz w:val="18"/>
+              </w:rPr>
+              <w:t>06</w:t>
+            </w:r>
+          </w:p>
+        </w:tc>
+        <w:tc>
+          <w:tcPr>
+            <w:tcW w:type="dxa" w:w="1872"/>
+            <w:shd w:fill="FFFFFF"/>
+            <w:tcMar>
+              <w:top w:w="100" w:type="dxa"/>
+              <w:bottom w:w="100" w:type="dxa"/>
+              <w:left w:w="120" w:type="dxa"/>
+              <w:right w:w="120" w:type="dxa"/>
+            </w:tcMar>
+          </w:tcPr>
+          <w:p>
+            <w:pPr>
+              <w:spacing w:before="40" w:after="40"/>
+            </w:pPr>
+            <w:r>
+              <w:rPr>
+                <w:rFonts w:ascii="Consolas" w:hAnsi="Consolas"/>
+                <w:color w:val="0284C7"/>
+                <w:sz w:val="16"/>
+              </w:rPr>
+              <w:t>videos/06-control-remoto-hdmi-ota.webm</w:t>
+            </w:r>
+          </w:p>
+        </w:tc>
+        <w:tc>
+          <w:tcPr>
+            <w:tcW w:type="dxa" w:w="1872"/>
+            <w:shd w:fill="FFFFFF"/>
+            <w:tcMar>
+              <w:top w:w="100" w:type="dxa"/>
+              <w:bottom w:w="100" w:type="dxa"/>
+              <w:left w:w="120" w:type="dxa"/>
+              <w:right w:w="120" w:type="dxa"/>
+            </w:tcMar>
+          </w:tcPr>
+          <w:p>
+            <w:pPr>
+              <w:spacing w:before="40" w:after="40"/>
+            </w:pPr>
+            <w:r>
+              <w:rPr>
+                <w:rFonts w:ascii="Calibri" w:hAnsi="Calibri"/>
+                <w:color w:val="1E293B"/>
+                <w:sz w:val="18"/>
+              </w:rPr>
+              <w:t>2.04 MB</w:t>
+            </w:r>
+          </w:p>
+        </w:tc>
+        <w:tc>
+          <w:tcPr>
+            <w:tcW w:type="dxa" w:w="1872"/>
+            <w:shd w:fill="FFFFFF"/>
+            <w:tcMar>
+              <w:top w:w="100" w:type="dxa"/>
+              <w:bottom w:w="100" w:type="dxa"/>
+              <w:left w:w="120" w:type="dxa"/>
+              <w:right w:w="120" w:type="dxa"/>
+            </w:tcMar>
+          </w:tcPr>
+          <w:p>
+            <w:pPr>
+              <w:spacing w:before="40" w:after="40"/>
+            </w:pPr>
+            <w:r>
+              <w:rPr>
+                <w:rFonts w:ascii="Calibri" w:hAnsi="Calibri"/>
+                <w:color w:val="1E293B"/>
+                <w:sz w:val="18"/>
+              </w:rPr>
+              <w:t>~30s</w:t>
+            </w:r>
+          </w:p>
+        </w:tc>
+        <w:tc>
+          <w:tcPr>
+            <w:tcW w:type="dxa" w:w="1872"/>
+            <w:shd w:fill="FFFFFF"/>
+            <w:tcMar>
+              <w:top w:w="100" w:type="dxa"/>
+              <w:bottom w:w="100" w:type="dxa"/>
+              <w:left w:w="120" w:type="dxa"/>
+              <w:right w:w="120" w:type="dxa"/>
+            </w:tcMar>
+          </w:tcPr>
+          <w:p>
+            <w:pPr>
+              <w:spacing w:before="40" w:after="40"/>
+            </w:pPr>
+            <w:r>
+              <w:rPr>
+                <w:rFonts w:ascii="Calibri" w:hAnsi="Calibri"/>
+                <w:b/>
+                <w:color w:val="1E293B"/>
+                <w:sz w:val="18"/>
+              </w:rPr>
+              <w:t>Control Remoto HDMI-CEC y Actualizaciones OTA:</w:t>
+            </w:r>
+            <w:r>
+              <w:rPr>
+                <w:rFonts w:ascii="Calibri" w:hAnsi="Calibri"/>
+                <w:color w:val="1E293B"/>
+                <w:sz w:val="18"/>
+              </w:rPr>
+              <w:t xml:space="preserve"> Envío de órdenes masivas MQTT de encendido y apagado (</w:t>
+            </w:r>
+            <w:r>
+              <w:rPr>
+                <w:rFonts w:ascii="Calibri" w:hAnsi="Calibri"/>
+                <w:i/>
+                <w:color w:val="1E293B"/>
+                <w:sz w:val="18"/>
+              </w:rPr>
+              <w:t>Encender Todas</w:t>
+            </w:r>
+            <w:r>
+              <w:rPr>
+                <w:rFonts w:ascii="Calibri" w:hAnsi="Calibri"/>
+                <w:color w:val="1E293B"/>
+                <w:sz w:val="18"/>
+              </w:rPr>
+              <w:t xml:space="preserve"> / </w:t>
+            </w:r>
+            <w:r>
+              <w:rPr>
+                <w:rFonts w:ascii="Calibri" w:hAnsi="Calibri"/>
+                <w:i/>
+                <w:color w:val="1E293B"/>
+                <w:sz w:val="18"/>
+              </w:rPr>
+              <w:t>Apagar Todas</w:t>
+            </w:r>
+            <w:r>
+              <w:rPr>
+                <w:rFonts w:ascii="Calibri" w:hAnsi="Calibri"/>
+                <w:color w:val="1E293B"/>
+                <w:sz w:val="18"/>
+              </w:rPr>
+              <w:t>) y despliegue remoto de software a las consolas sin visitas técnicas.</w:t>
+            </w:r>
+          </w:p>
+        </w:tc>
+      </w:tr>
+      <w:tr>
+        <w:tc>
+          <w:tcPr>
+            <w:tcW w:type="dxa" w:w="1872"/>
+            <w:shd w:fill="F8FAFC"/>
+            <w:tcMar>
+              <w:top w:w="100" w:type="dxa"/>
+              <w:bottom w:w="100" w:type="dxa"/>
+              <w:left w:w="120" w:type="dxa"/>
+              <w:right w:w="120" w:type="dxa"/>
+            </w:tcMar>
+          </w:tcPr>
+          <w:p>
+            <w:pPr>
+              <w:spacing w:before="40" w:after="40"/>
+            </w:pPr>
+            <w:r>
+              <w:rPr>
+                <w:rFonts w:ascii="Calibri" w:hAnsi="Calibri"/>
+                <w:b/>
+                <w:color w:val="1E293B"/>
+                <w:sz w:val="18"/>
+              </w:rPr>
+              <w:t>07</w:t>
+            </w:r>
+          </w:p>
+        </w:tc>
+        <w:tc>
+          <w:tcPr>
+            <w:tcW w:type="dxa" w:w="1872"/>
+            <w:shd w:fill="F8FAFC"/>
+            <w:tcMar>
+              <w:top w:w="100" w:type="dxa"/>
+              <w:bottom w:w="100" w:type="dxa"/>
+              <w:left w:w="120" w:type="dxa"/>
+              <w:right w:w="120" w:type="dxa"/>
+            </w:tcMar>
+          </w:tcPr>
+          <w:p>
+            <w:pPr>
+              <w:spacing w:before="40" w:after="40"/>
+            </w:pPr>
+            <w:r>
+              <w:rPr>
+                <w:rFonts w:ascii="Consolas" w:hAnsi="Consolas"/>
+                <w:color w:val="0284C7"/>
+                <w:sz w:val="16"/>
+              </w:rPr>
+              <w:t>videos/07-roles-admin-vs-cliente.webm</w:t>
+            </w:r>
+          </w:p>
+        </w:tc>
+        <w:tc>
+          <w:tcPr>
+            <w:tcW w:type="dxa" w:w="1872"/>
+            <w:shd w:fill="F8FAFC"/>
+            <w:tcMar>
+              <w:top w:w="100" w:type="dxa"/>
+              <w:bottom w:w="100" w:type="dxa"/>
+              <w:left w:w="120" w:type="dxa"/>
+              <w:right w:w="120" w:type="dxa"/>
+            </w:tcMar>
+          </w:tcPr>
+          <w:p>
+            <w:pPr>
+              <w:spacing w:before="40" w:after="40"/>
+            </w:pPr>
+            <w:r>
+              <w:rPr>
+                <w:rFonts w:ascii="Calibri" w:hAnsi="Calibri"/>
+                <w:color w:val="1E293B"/>
+                <w:sz w:val="18"/>
+              </w:rPr>
+              <w:t>2.16 MB</w:t>
+            </w:r>
+          </w:p>
+        </w:tc>
+        <w:tc>
+          <w:tcPr>
+            <w:tcW w:type="dxa" w:w="1872"/>
+            <w:shd w:fill="F8FAFC"/>
+            <w:tcMar>
+              <w:top w:w="100" w:type="dxa"/>
+              <w:bottom w:w="100" w:type="dxa"/>
+              <w:left w:w="120" w:type="dxa"/>
+              <w:right w:w="120" w:type="dxa"/>
+            </w:tcMar>
+          </w:tcPr>
+          <w:p>
+            <w:pPr>
+              <w:spacing w:before="40" w:after="40"/>
+            </w:pPr>
+            <w:r>
+              <w:rPr>
+                <w:rFonts w:ascii="Calibri" w:hAnsi="Calibri"/>
+                <w:color w:val="1E293B"/>
+                <w:sz w:val="18"/>
+              </w:rPr>
+              <w:t>~30s</w:t>
+            </w:r>
+          </w:p>
+        </w:tc>
+        <w:tc>
+          <w:tcPr>
+            <w:tcW w:type="dxa" w:w="1872"/>
+            <w:shd w:fill="F8FAFC"/>
+            <w:tcMar>
+              <w:top w:w="100" w:type="dxa"/>
+              <w:bottom w:w="100" w:type="dxa"/>
+              <w:left w:w="120" w:type="dxa"/>
+              <w:right w:w="120" w:type="dxa"/>
+            </w:tcMar>
+          </w:tcPr>
+          <w:p>
+            <w:pPr>
+              <w:spacing w:before="40" w:after="40"/>
+            </w:pPr>
+            <w:r>
+              <w:rPr>
+                <w:rFonts w:ascii="Calibri" w:hAnsi="Calibri"/>
+                <w:b/>
+                <w:color w:val="1E293B"/>
+                <w:sz w:val="18"/>
+              </w:rPr>
+              <w:t>Diferencia de Roles (Super Admin vs. Cliente):</w:t>
+            </w:r>
+            <w:r>
+              <w:rPr>
+                <w:rFonts w:ascii="Calibri" w:hAnsi="Calibri"/>
+                <w:color w:val="1E293B"/>
+                <w:sz w:val="18"/>
+              </w:rPr>
+              <w:t xml:space="preserve"> Demostración del acceso irrestricto del Super Admin frente a la vista limpia, privada y aislada del Cliente (que solo ve sus pantallas y cuota disponible).</w:t>
+            </w:r>
+          </w:p>
+        </w:tc>
+      </w:tr>
+      <w:tr>
+        <w:tc>
+          <w:tcPr>
+            <w:tcW w:type="dxa" w:w="1872"/>
+            <w:shd w:fill="FFFFFF"/>
+            <w:tcMar>
+              <w:top w:w="100" w:type="dxa"/>
+              <w:bottom w:w="100" w:type="dxa"/>
+              <w:left w:w="120" w:type="dxa"/>
+              <w:right w:w="120" w:type="dxa"/>
+            </w:tcMar>
+          </w:tcPr>
+          <w:p>
+            <w:pPr>
+              <w:spacing w:before="40" w:after="40"/>
+            </w:pPr>
+            <w:r>
+              <w:rPr>
+                <w:rFonts w:ascii="Calibri" w:hAnsi="Calibri"/>
+                <w:b/>
+                <w:color w:val="1E293B"/>
+                <w:sz w:val="18"/>
+              </w:rPr>
+              <w:t>08</w:t>
+            </w:r>
+          </w:p>
+        </w:tc>
+        <w:tc>
+          <w:tcPr>
+            <w:tcW w:type="dxa" w:w="1872"/>
+            <w:shd w:fill="FFFFFF"/>
+            <w:tcMar>
+              <w:top w:w="100" w:type="dxa"/>
+              <w:bottom w:w="100" w:type="dxa"/>
+              <w:left w:w="120" w:type="dxa"/>
+              <w:right w:w="120" w:type="dxa"/>
+            </w:tcMar>
+          </w:tcPr>
+          <w:p>
+            <w:pPr>
+              <w:spacing w:before="40" w:after="40"/>
+            </w:pPr>
+            <w:r>
+              <w:rPr>
+                <w:rFonts w:ascii="Consolas" w:hAnsi="Consolas"/>
+                <w:color w:val="0284C7"/>
+                <w:sz w:val="16"/>
+              </w:rPr>
+              <w:t>videos/08-mantenimiento-y-bajas.webm</w:t>
+            </w:r>
+          </w:p>
+        </w:tc>
+        <w:tc>
+          <w:tcPr>
+            <w:tcW w:type="dxa" w:w="1872"/>
+            <w:shd w:fill="FFFFFF"/>
+            <w:tcMar>
+              <w:top w:w="100" w:type="dxa"/>
+              <w:bottom w:w="100" w:type="dxa"/>
+              <w:left w:w="120" w:type="dxa"/>
+              <w:right w:w="120" w:type="dxa"/>
+            </w:tcMar>
+          </w:tcPr>
+          <w:p>
+            <w:pPr>
+              <w:spacing w:before="40" w:after="40"/>
+            </w:pPr>
+            <w:r>
+              <w:rPr>
+                <w:rFonts w:ascii="Calibri" w:hAnsi="Calibri"/>
+                <w:color w:val="1E293B"/>
+                <w:sz w:val="18"/>
+              </w:rPr>
+              <w:t>2.45 MB</w:t>
+            </w:r>
+          </w:p>
+        </w:tc>
+        <w:tc>
+          <w:tcPr>
+            <w:tcW w:type="dxa" w:w="1872"/>
+            <w:shd w:fill="FFFFFF"/>
+            <w:tcMar>
+              <w:top w:w="100" w:type="dxa"/>
+              <w:bottom w:w="100" w:type="dxa"/>
+              <w:left w:w="120" w:type="dxa"/>
+              <w:right w:w="120" w:type="dxa"/>
+            </w:tcMar>
+          </w:tcPr>
+          <w:p>
+            <w:pPr>
+              <w:spacing w:before="40" w:after="40"/>
+            </w:pPr>
+            <w:r>
+              <w:rPr>
+                <w:rFonts w:ascii="Calibri" w:hAnsi="Calibri"/>
+                <w:color w:val="1E293B"/>
+                <w:sz w:val="18"/>
+              </w:rPr>
+              <w:t>~31s</w:t>
+            </w:r>
+          </w:p>
+        </w:tc>
+        <w:tc>
+          <w:tcPr>
+            <w:tcW w:type="dxa" w:w="1872"/>
+            <w:shd w:fill="FFFFFF"/>
+            <w:tcMar>
+              <w:top w:w="100" w:type="dxa"/>
+              <w:bottom w:w="100" w:type="dxa"/>
+              <w:left w:w="120" w:type="dxa"/>
+              <w:right w:w="120" w:type="dxa"/>
+            </w:tcMar>
+          </w:tcPr>
+          <w:p>
+            <w:pPr>
+              <w:spacing w:before="40" w:after="40"/>
+            </w:pPr>
+            <w:r>
+              <w:rPr>
+                <w:rFonts w:ascii="Calibri" w:hAnsi="Calibri"/>
+                <w:b/>
+                <w:color w:val="1E293B"/>
+                <w:sz w:val="18"/>
+              </w:rPr>
+              <w:t>Desasignación y Eliminación de Recursos:</w:t>
+            </w:r>
+            <w:r>
+              <w:rPr>
+                <w:rFonts w:ascii="Calibri" w:hAnsi="Calibri"/>
+                <w:color w:val="1E293B"/>
+                <w:sz w:val="18"/>
+              </w:rPr>
+              <w:t xml:space="preserve"> Ciclo completo de bajas. Retiro de video de rotación (liberando cuota), borrado definitivo de spot, cancelación de programación arcade, baja de pantalla física y cierre de cuenta de cliente y plan.</w:t>
+            </w:r>
+          </w:p>
+        </w:tc>
+      </w:tr>
+    </w:tbl>
+    <w:p>
+      <w:pPr>
+        <w:spacing w:before="0" w:after="120"/>
+      </w:pPr>
+    </w:p>
+    <w:p>
+      <w:pPr>
+        <w:spacing w:before="240" w:after="60"/>
+      </w:pPr>
+      <w:r>
+        <w:rPr>
+          <w:rFonts w:ascii="Calibri" w:hAnsi="Calibri"/>
+          <w:b/>
+          <w:color w:val="0369A1"/>
+          <w:sz w:val="24"/>
+        </w:rPr>
+        <w:t>12.2. Automatización y Regeneración con Playwright</w:t>
+      </w:r>
+    </w:p>
+    <w:p>
+      <w:pPr>
+        <w:spacing w:before="40" w:after="100" w:line="276" w:lineRule="auto"/>
+      </w:pPr>
+      <w:r>
+        <w:rPr>
+          <w:rFonts w:ascii="Calibri" w:hAnsi="Calibri"/>
+          <w:color w:val="1E293B"/>
+          <w:sz w:val="21"/>
+        </w:rPr>
+        <w:t xml:space="preserve">Las grabaciones son 100% reproducibles mediante scripts automatizados alojados en </w:t>
+      </w:r>
+      <w:r>
+        <w:rPr>
+          <w:rFonts w:ascii="Consolas" w:hAnsi="Consolas"/>
+          <w:color w:val="0284C7"/>
+          <w:sz w:val="19"/>
+        </w:rPr>
+        <w:t>portal/scripts/</w:t>
+      </w:r>
+      <w:r>
+        <w:rPr>
+          <w:rFonts w:ascii="Calibri" w:hAnsi="Calibri"/>
+          <w:color w:val="1E293B"/>
+          <w:sz w:val="21"/>
+        </w:rPr>
+        <w:t>:</w:t>
+      </w:r>
+    </w:p>
+    <w:tbl>
+      <w:tblPr>
+        <w:tblW w:type="auto" w:w="0"/>
+        <w:jc w:val="center"/>
+        <w:tblLook w:firstColumn="1" w:firstRow="1" w:lastColumn="0" w:lastRow="0" w:noHBand="0" w:noVBand="1" w:val="04A0"/>
+      </w:tblPr>
+      <w:tblGrid>
+        <w:gridCol w:w="9360"/>
+      </w:tblGrid>
+      <w:tr>
+        <w:tc>
+          <w:tcPr>
+            <w:tcW w:type="dxa" w:w="9360"/>
+            <w:shd w:fill="F1F5F9"/>
+            <w:tcMar>
+              <w:top w:w="140" w:type="dxa"/>
+              <w:bottom w:w="140" w:type="dxa"/>
+              <w:left w:w="200" w:type="dxa"/>
+              <w:right w:w="200" w:type="dxa"/>
+            </w:tcMar>
+            <w:tcBorders>
+              <w:top w:val="single" w:sz="4" w:space="0" w:color="CBD5E1"/>
+              <w:left w:val="single" w:sz="18" w:space="0" w:color="0284C7"/>
+              <w:bottom w:val="single" w:sz="4" w:space="0" w:color="CBD5E1"/>
+              <w:right w:val="single" w:sz="4" w:space="0" w:color="CBD5E1"/>
+            </w:tcBorders>
+          </w:tcPr>
+          <w:p>
+            <w:pPr>
+              <w:spacing w:before="40" w:after="40" w:line="252" w:lineRule="auto"/>
+            </w:pPr>
+            <w:r>
+              <w:rPr>
+                <w:rFonts w:ascii="Consolas" w:hAnsi="Consolas"/>
+                <w:color w:val="0F172A"/>
+                <w:sz w:val="17"/>
+              </w:rPr>
+              <w:t># Grabar la serie completa de los 8 videos en secuencia:</w:t>
+              <w:br/>
+              <w:t>cd portal &amp;&amp; node scripts/record-all-videos.mjs</w:t>
+              <w:br/>
+              <w:br/>
+              <w:t># Grabar una cápsula específica individualmente:</w:t>
+              <w:br/>
+              <w:t>cd portal &amp;&amp; node scripts/record-01-planes.mjs</w:t>
+              <w:br/>
+              <w:t>cd portal &amp;&amp; node scripts/record-02-pantalla.mjs</w:t>
+              <w:br/>
+              <w:t>cd portal &amp;&amp; node scripts/record-03-cliente.mjs</w:t>
+              <w:br/>
+              <w:t>cd portal &amp;&amp; node scripts/record-04-videos.mjs</w:t>
+              <w:br/>
+              <w:t>cd portal &amp;&amp; node scripts/record-05-juegos.mjs</w:t>
+              <w:br/>
+              <w:t>cd portal &amp;&amp; node scripts/record-06-control-remoto.mjs</w:t>
+              <w:br/>
+              <w:t>cd portal &amp;&amp; node scripts/record-07-roles.mjs</w:t>
+              <w:br/>
+              <w:t>cd portal &amp;&amp; node scripts/record-08-mantenimiento.mjs</w:t>
+            </w:r>
+          </w:p>
+        </w:tc>
+      </w:tr>
+    </w:tbl>
+    <w:p>
+      <w:pPr>
+        <w:spacing w:before="0" w:after="80"/>
+      </w:pPr>
+    </w:p>
+    <w:p>
+      <w:pPr>
+        <w:spacing w:before="40" w:after="100" w:line="276" w:lineRule="auto"/>
+      </w:pPr>
+      <w:r>
+        <w:rPr>
+          <w:rFonts w:ascii="Calibri" w:hAnsi="Calibri"/>
+          <w:color w:val="1E293B"/>
+          <w:sz w:val="21"/>
+        </w:rPr>
+        <w:t xml:space="preserve">Los videos generados se guardan automáticamente en la carpeta </w:t>
+      </w:r>
+      <w:r>
+        <w:rPr>
+          <w:rFonts w:ascii="Consolas" w:hAnsi="Consolas"/>
+          <w:color w:val="0284C7"/>
+          <w:sz w:val="19"/>
+        </w:rPr>
+        <w:t>docs/videos/</w:t>
+      </w:r>
+      <w:r>
+        <w:rPr>
+          <w:rFonts w:ascii="Calibri" w:hAnsi="Calibri"/>
+          <w:color w:val="1E293B"/>
+          <w:sz w:val="21"/>
+        </w:rPr>
+        <w:t xml:space="preserve"> listos para ser reproducidos en navegadores web modernos o integrados en plataformas de capacitación y marketing.</w:t>
       </w:r>
     </w:p>
     <w:sectPr>

</xml_diff>